<commit_message>
Correct logo font in style guide (Roboto, styled in Canva)
</commit_message>
<xml_diff>
--- a/The-Hughes-Practice-Style-Guide.docx
+++ b/The-Hughes-Practice-Style-Guide.docx
@@ -128,7 +128,7 @@
         <w:rPr>
           <w:color w:val="56545E"/>
         </w:rPr>
-        <w:t>The wordmark reads THE HUGHES PRACTICE with the subtitle THERAPY FOR REAL LIFE. Title set in Cagliostro, subtitle in Yaldevi (both baked into the artwork).</w:t>
+        <w:t>The wordmark reads THE HUGHES PRACTICE with the subtitle THERAPY FOR REAL LIFE. Both are set in Roboto, with custom letter-spacing and an outline effect applied in Canva (baked into the artwork).</w:t>
       </w:r>
     </w:p>
     <w:p>
@@ -1129,7 +1129,7 @@
           <w:color w:val="56545E"/>
           <w:sz w:val="19"/>
         </w:rPr>
-        <w:t>Note: the logo’s own fonts (Cagliostro / Yaldevi) live only in the logo artwork and are not used elsewhere on the site.</w:t>
+        <w:t>Note: the logo is set in Roboto (styled in Canva) and baked into the artwork; the website itself uses Roboto Mono throughout.</w:t>
       </w:r>
     </w:p>
     <w:p>

</xml_diff>